<commit_message>
fix: update report template year and improve photo section formatting
</commit_message>
<xml_diff>
--- a/public/nss-report.docx
+++ b/public/nss-report.docx
@@ -226,7 +226,7 @@
                 <w:sz w:val="32"/>
                 <w:szCs w:val="32"/>
               </w:rPr>
-              <w:t>5</w:t>
+              <w:t>6</w:t>
             </w:r>
             <w:r>
               <w:rPr>
@@ -246,7 +246,7 @@
                 <w:sz w:val="32"/>
                 <w:szCs w:val="32"/>
               </w:rPr>
-              <w:t>6</w:t>
+              <w:t>7</w:t>
             </w:r>
           </w:p>
         </w:tc>
@@ -338,25 +338,7 @@
           <w:b/>
           <w:bCs/>
         </w:rPr>
-        <w:t>{</w:t>
-      </w:r>
-      <w:proofErr w:type="spellStart"/>
-      <w:r>
-        <w:rPr>
-          <w:rFonts w:ascii="Arial" w:eastAsia="Arial" w:hAnsi="Arial" w:cs="Arial"/>
-          <w:b/>
-          <w:bCs/>
-        </w:rPr>
-        <w:t>activityTitle</w:t>
-      </w:r>
-      <w:proofErr w:type="spellEnd"/>
-      <w:r>
-        <w:rPr>
-          <w:rFonts w:ascii="Arial" w:eastAsia="Arial" w:hAnsi="Arial" w:cs="Arial"/>
-          <w:b/>
-          <w:bCs/>
-        </w:rPr>
-        <w:t>}</w:t>
+        <w:t>{activityTitle}</w:t>
       </w:r>
     </w:p>
     <w:p>
@@ -475,21 +457,7 @@
               <w:rPr>
                 <w:rFonts w:ascii="Arial" w:eastAsia="Arial" w:hAnsi="Arial" w:cs="Arial"/>
               </w:rPr>
-              <w:t>{</w:t>
-            </w:r>
-            <w:proofErr w:type="spellStart"/>
-            <w:r>
-              <w:rPr>
-                <w:rFonts w:ascii="Arial" w:eastAsia="Arial" w:hAnsi="Arial" w:cs="Arial"/>
-              </w:rPr>
-              <w:t>activityTitle</w:t>
-            </w:r>
-            <w:proofErr w:type="spellEnd"/>
-            <w:r>
-              <w:rPr>
-                <w:rFonts w:ascii="Arial" w:eastAsia="Arial" w:hAnsi="Arial" w:cs="Arial"/>
-              </w:rPr>
-              <w:t>}</w:t>
+              <w:t>{activityTitle}</w:t>
             </w:r>
           </w:p>
         </w:tc>
@@ -798,21 +766,7 @@
               <w:rPr>
                 <w:rFonts w:ascii="Arial" w:eastAsia="Arial" w:hAnsi="Arial" w:cs="Arial"/>
               </w:rPr>
-              <w:t>{</w:t>
-            </w:r>
-            <w:proofErr w:type="spellStart"/>
-            <w:r>
-              <w:rPr>
-                <w:rFonts w:ascii="Arial" w:eastAsia="Arial" w:hAnsi="Arial" w:cs="Arial"/>
-              </w:rPr>
-              <w:t>activityCoordinator</w:t>
-            </w:r>
-            <w:proofErr w:type="spellEnd"/>
-            <w:r>
-              <w:rPr>
-                <w:rFonts w:ascii="Arial" w:eastAsia="Arial" w:hAnsi="Arial" w:cs="Arial"/>
-              </w:rPr>
-              <w:t>}</w:t>
+              <w:t>{activityCoordinator}</w:t>
             </w:r>
           </w:p>
         </w:tc>
@@ -944,21 +898,7 @@
               <w:rPr>
                 <w:rFonts w:ascii="Arial" w:eastAsia="Arial" w:hAnsi="Arial" w:cs="Arial"/>
               </w:rPr>
-              <w:t>{</w:t>
-            </w:r>
-            <w:proofErr w:type="spellStart"/>
-            <w:r>
-              <w:rPr>
-                <w:rFonts w:ascii="Arial" w:eastAsia="Arial" w:hAnsi="Arial" w:cs="Arial"/>
-              </w:rPr>
-              <w:t>organizingUnit</w:t>
-            </w:r>
-            <w:proofErr w:type="spellEnd"/>
-            <w:r>
-              <w:rPr>
-                <w:rFonts w:ascii="Arial" w:eastAsia="Arial" w:hAnsi="Arial" w:cs="Arial"/>
-              </w:rPr>
-              <w:t>}</w:t>
+              <w:t>{organizingUnit}</w:t>
             </w:r>
           </w:p>
         </w:tc>
@@ -1030,21 +970,7 @@
               <w:rPr>
                 <w:rFonts w:ascii="Arial" w:eastAsia="Arial" w:hAnsi="Arial" w:cs="Arial"/>
               </w:rPr>
-              <w:t>{</w:t>
-            </w:r>
-            <w:proofErr w:type="spellStart"/>
-            <w:r>
-              <w:rPr>
-                <w:rFonts w:ascii="Arial" w:eastAsia="Arial" w:hAnsi="Arial" w:cs="Arial"/>
-              </w:rPr>
-              <w:t>in_points</w:t>
-            </w:r>
-            <w:proofErr w:type="spellEnd"/>
-            <w:r>
-              <w:rPr>
-                <w:rFonts w:ascii="Arial" w:eastAsia="Arial" w:hAnsi="Arial" w:cs="Arial"/>
-              </w:rPr>
-              <w:t>}</w:t>
+              <w:t>{in_points}</w:t>
             </w:r>
           </w:p>
         </w:tc>
@@ -3444,6 +3370,33 @@
 </file>
 
 <file path=customXml/item1.xml><?xml version="1.0" encoding="utf-8"?>
+<go:gDocsCustomXmlDataStorage xmlns:go="http://customooxmlschemas.google.com/" xmlns:r="http://schemas.openxmlformats.org/officeDocument/2006/relationships" uri="GoogleDocsCustomDataVersion2">
+  <go:docsCustomData xmlns:go="http://customooxmlschemas.google.com/" roundtripDataSignature="AMtx7mhho/nAe37LWwrl8/2HTW0NC/hKUw==">CgMxLjAyCGguZ2pkZ3hzOAByITFwb3lSSGlYNEs1dy1NSTlUWXdaZUwxNnFtSjJHQjRVRA==</go:docsCustomData>
+</go:gDocsCustomXmlDataStorage>
+</file>
+
+<file path=customXml/item2.xml><?xml version="1.0" encoding="utf-8"?>
+<b:Sources xmlns:b="http://schemas.openxmlformats.org/officeDocument/2006/bibliography" xmlns="http://schemas.openxmlformats.org/officeDocument/2006/bibliography" SelectedStyle="\APASixthEditionOfficeOnline.xsl" StyleName="APA" Version="6"/>
+</file>
+
+<file path=customXml/item3.xml><?xml version="1.0" encoding="utf-8"?>
+<p:properties xmlns:p="http://schemas.microsoft.com/office/2006/metadata/properties" xmlns:xsi="http://www.w3.org/2001/XMLSchema-instance" xmlns:pc="http://schemas.microsoft.com/office/infopath/2007/PartnerControls">
+  <documentManagement>
+    <_activity xmlns="b90a5dd7-aa71-4a85-8f48-13c6fa835524" xsi:nil="true"/>
+  </documentManagement>
+</p:properties>
+</file>
+
+<file path=customXml/item4.xml><?xml version="1.0" encoding="utf-8"?>
+<?mso-contentType ?>
+<FormTemplates xmlns="http://schemas.microsoft.com/sharepoint/v3/contenttype/forms">
+  <Display>DocumentLibraryForm</Display>
+  <Edit>DocumentLibraryForm</Edit>
+  <New>DocumentLibraryForm</New>
+</FormTemplates>
+</file>
+
+<file path=customXml/item5.xml><?xml version="1.0" encoding="utf-8"?>
 <ct:contentTypeSchema xmlns:ct="http://schemas.microsoft.com/office/2006/metadata/contentType" xmlns:ma="http://schemas.microsoft.com/office/2006/metadata/properties/metaAttributes" ct:_="" ma:_="" ma:contentTypeName="Document" ma:contentTypeID="0x0101004AB5B28D5E4A8843939702098EA1F738" ma:contentTypeVersion="15" ma:contentTypeDescription="Create a new document." ma:contentTypeScope="" ma:versionID="a74a2eb69422255f228d0b055386623c">
   <xsd:schema xmlns:xsd="http://www.w3.org/2001/XMLSchema" xmlns:xs="http://www.w3.org/2001/XMLSchema" xmlns:p="http://schemas.microsoft.com/office/2006/metadata/properties" xmlns:ns3="b90a5dd7-aa71-4a85-8f48-13c6fa835524" xmlns:ns4="18476398-8ca6-4946-94a6-ac9e400438d5" targetNamespace="http://schemas.microsoft.com/office/2006/metadata/properties" ma:root="true" ma:fieldsID="cbd4073dc0202f84877093169fa8f9f0" ns3:_="" ns4:_="">
     <xsd:import namespace="b90a5dd7-aa71-4a85-8f48-13c6fa835524"/>
@@ -3676,34 +3629,42 @@
 </ct:contentTypeSchema>
 </file>
 
-<file path=customXml/item2.xml><?xml version="1.0" encoding="utf-8"?>
-<?mso-contentType ?>
-<FormTemplates xmlns="http://schemas.microsoft.com/sharepoint/v3/contenttype/forms">
-  <Display>DocumentLibraryForm</Display>
-  <Edit>DocumentLibraryForm</Edit>
-  <New>DocumentLibraryForm</New>
-</FormTemplates>
+<file path=customXml/itemProps1.xml><?xml version="1.0" encoding="utf-8"?>
+<ds:datastoreItem xmlns:ds="http://schemas.openxmlformats.org/officeDocument/2006/customXml" ds:itemID="{11111111-1234-1234-1234-123412341234}">
+  <ds:schemaRefs>
+    <ds:schemaRef ds:uri="http://customooxmlschemas.google.com/"/>
+    <ds:schemaRef ds:uri="http://schemas.openxmlformats.org/officeDocument/2006/relationships"/>
+  </ds:schemaRefs>
+</ds:datastoreItem>
 </file>
 
-<file path=customXml/item3.xml><?xml version="1.0" encoding="utf-8"?>
-<p:properties xmlns:p="http://schemas.microsoft.com/office/2006/metadata/properties" xmlns:xsi="http://www.w3.org/2001/XMLSchema-instance" xmlns:pc="http://schemas.microsoft.com/office/infopath/2007/PartnerControls">
-  <documentManagement>
-    <_activity xmlns="b90a5dd7-aa71-4a85-8f48-13c6fa835524" xsi:nil="true"/>
-  </documentManagement>
-</p:properties>
+<file path=customXml/itemProps2.xml><?xml version="1.0" encoding="utf-8"?>
+<ds:datastoreItem xmlns:ds="http://schemas.openxmlformats.org/officeDocument/2006/customXml" ds:itemID="{2D3D784A-26E4-43C8-B2BE-75C33B03B68D}">
+  <ds:schemaRefs>
+    <ds:schemaRef ds:uri="http://schemas.openxmlformats.org/officeDocument/2006/bibliography"/>
+  </ds:schemaRefs>
+</ds:datastoreItem>
 </file>
 
-<file path=customXml/item4.xml><?xml version="1.0" encoding="utf-8"?>
-<b:Sources xmlns:b="http://schemas.openxmlformats.org/officeDocument/2006/bibliography" xmlns="http://schemas.openxmlformats.org/officeDocument/2006/bibliography" SelectedStyle="\APASixthEditionOfficeOnline.xsl" StyleName="APA" Version="6"/>
+<file path=customXml/itemProps3.xml><?xml version="1.0" encoding="utf-8"?>
+<ds:datastoreItem xmlns:ds="http://schemas.openxmlformats.org/officeDocument/2006/customXml" ds:itemID="{219B6FFE-09C9-42D1-BDDC-5832733635F0}">
+  <ds:schemaRefs>
+    <ds:schemaRef ds:uri="http://schemas.microsoft.com/office/2006/metadata/properties"/>
+    <ds:schemaRef ds:uri="http://schemas.microsoft.com/office/infopath/2007/PartnerControls"/>
+    <ds:schemaRef ds:uri="b90a5dd7-aa71-4a85-8f48-13c6fa835524"/>
+  </ds:schemaRefs>
+</ds:datastoreItem>
 </file>
 
-<file path=customXml/item5.xml><?xml version="1.0" encoding="utf-8"?>
-<go:gDocsCustomXmlDataStorage xmlns:go="http://customooxmlschemas.google.com/" xmlns:r="http://schemas.openxmlformats.org/officeDocument/2006/relationships" uri="GoogleDocsCustomDataVersion2">
-  <go:docsCustomData xmlns:go="http://customooxmlschemas.google.com/" roundtripDataSignature="AMtx7mhho/nAe37LWwrl8/2HTW0NC/hKUw==">CgMxLjAyCGguZ2pkZ3hzOAByITFwb3lSSGlYNEs1dy1NSTlUWXdaZUwxNnFtSjJHQjRVRA==</go:docsCustomData>
-</go:gDocsCustomXmlDataStorage>
+<file path=customXml/itemProps4.xml><?xml version="1.0" encoding="utf-8"?>
+<ds:datastoreItem xmlns:ds="http://schemas.openxmlformats.org/officeDocument/2006/customXml" ds:itemID="{81E4BF22-E8C7-4C09-8BF8-BFA616310176}">
+  <ds:schemaRefs>
+    <ds:schemaRef ds:uri="http://schemas.microsoft.com/sharepoint/v3/contenttype/forms"/>
+  </ds:schemaRefs>
+</ds:datastoreItem>
 </file>
 
-<file path=customXml/itemProps1.xml><?xml version="1.0" encoding="utf-8"?>
+<file path=customXml/itemProps5.xml><?xml version="1.0" encoding="utf-8"?>
 <ds:datastoreItem xmlns:ds="http://schemas.openxmlformats.org/officeDocument/2006/customXml" ds:itemID="{458D1DC3-0744-42CA-BC54-7808595FD600}">
   <ds:schemaRefs>
     <ds:schemaRef ds:uri="http://schemas.microsoft.com/office/2006/metadata/contentType"/>
@@ -3720,39 +3681,4 @@
     <ds:schemaRef ds:uri="http://schemas.microsoft.com/internal/obd"/>
   </ds:schemaRefs>
 </ds:datastoreItem>
-</file>
-
-<file path=customXml/itemProps2.xml><?xml version="1.0" encoding="utf-8"?>
-<ds:datastoreItem xmlns:ds="http://schemas.openxmlformats.org/officeDocument/2006/customXml" ds:itemID="{81E4BF22-E8C7-4C09-8BF8-BFA616310176}">
-  <ds:schemaRefs>
-    <ds:schemaRef ds:uri="http://schemas.microsoft.com/sharepoint/v3/contenttype/forms"/>
-  </ds:schemaRefs>
-</ds:datastoreItem>
-</file>
-
-<file path=customXml/itemProps3.xml><?xml version="1.0" encoding="utf-8"?>
-<ds:datastoreItem xmlns:ds="http://schemas.openxmlformats.org/officeDocument/2006/customXml" ds:itemID="{219B6FFE-09C9-42D1-BDDC-5832733635F0}">
-  <ds:schemaRefs>
-    <ds:schemaRef ds:uri="http://schemas.microsoft.com/office/2006/metadata/properties"/>
-    <ds:schemaRef ds:uri="http://schemas.microsoft.com/office/infopath/2007/PartnerControls"/>
-    <ds:schemaRef ds:uri="b90a5dd7-aa71-4a85-8f48-13c6fa835524"/>
-  </ds:schemaRefs>
-</ds:datastoreItem>
-</file>
-
-<file path=customXml/itemProps4.xml><?xml version="1.0" encoding="utf-8"?>
-<ds:datastoreItem xmlns:ds="http://schemas.openxmlformats.org/officeDocument/2006/customXml" ds:itemID="{2D3D784A-26E4-43C8-B2BE-75C33B03B68D}">
-  <ds:schemaRefs>
-    <ds:schemaRef ds:uri="http://schemas.openxmlformats.org/officeDocument/2006/bibliography"/>
-  </ds:schemaRefs>
-</ds:datastoreItem>
-</file>
-
-<file path=customXml/itemProps5.xml><?xml version="1.0" encoding="utf-8"?>
-<ds:datastoreItem xmlns:ds="http://schemas.openxmlformats.org/officeDocument/2006/customXml" ds:itemID="{11111111-1234-1234-1234-123412341234}">
-  <ds:schemaRefs>
-    <ds:schemaRef ds:uri="http://customooxmlschemas.google.com/"/>
-    <ds:schemaRef ds:uri="http://schemas.openxmlformats.org/officeDocument/2006/relationships"/>
-  </ds:schemaRefs>
-</ds:datastoreItem>
 </file>
</xml_diff>